<commit_message>
Project docx: remove survey section and questionnaire appendix
Co-Authored-By: Claude Opus 5.5 <noreply@anthropic.com>
Claude-Session: https://claude.ai/code/session_01GUmUi9gtWJW6PsnDGeagEh
</commit_message>
<xml_diff>
--- a/Индивидуальный_проект_Авиация_ВОВ_итог.docx
+++ b/Индивидуальный_проект_Авиация_ВОВ_итог.docx
@@ -635,16 +635,16 @@
           <w:tab w:val="right" w:pos="9355" w:leader="dot"/>
         </w:tabs>
         <w:spacing w:after="80"/>
-        <w:ind w:left="400" w:right="500"/>
-        <w:outlineLvl w:val="9"/>
-      </w:pPr>
-      <w:r>
-        <w:rPr>
-          <w:rFonts w:ascii="Times New Roman" w:cs="Times New Roman" w:eastAsia="Times New Roman" w:hAnsi="Times New Roman"/>
-          <w:sz w:val="28"/>
-          <w:szCs w:val="28"/>
-        </w:rPr>
-        <w:t xml:space="preserve">2.3 Анкетирование обучающихся	8</w:t>
+        <w:ind w:left="0" w:right="500"/>
+        <w:outlineLvl w:val="9"/>
+      </w:pPr>
+      <w:r>
+        <w:rPr>
+          <w:rFonts w:ascii="Times New Roman" w:cs="Times New Roman" w:eastAsia="Times New Roman" w:hAnsi="Times New Roman"/>
+          <w:sz w:val="28"/>
+          <w:szCs w:val="28"/>
+        </w:rPr>
+        <w:t xml:space="preserve">ЗАКЛЮЧЕНИЕ	9</w:t>
       </w:r>
     </w:p>
     <w:p>
@@ -662,7 +662,7 @@
           <w:sz w:val="28"/>
           <w:szCs w:val="28"/>
         </w:rPr>
-        <w:t xml:space="preserve">ЗАКЛЮЧЕНИЕ	10</w:t>
+        <w:t xml:space="preserve">СПИСОК ИСПОЛЬЗОВАННЫХ ИСТОЧНИКОВ	10</w:t>
       </w:r>
     </w:p>
     <w:p>
@@ -680,7 +680,7 @@
           <w:sz w:val="28"/>
           <w:szCs w:val="28"/>
         </w:rPr>
-        <w:t xml:space="preserve">СПИСОК ИСПОЛЬЗОВАННЫХ ИСТОЧНИКОВ	11</w:t>
+        <w:t xml:space="preserve">ПРИЛОЖЕНИЕ А Выдающиеся советские авиаторы Великой Отечественной войны	11</w:t>
       </w:r>
     </w:p>
     <w:p>
@@ -698,43 +698,7 @@
           <w:sz w:val="28"/>
           <w:szCs w:val="28"/>
         </w:rPr>
-        <w:t xml:space="preserve">ПРИЛОЖЕНИЕ А Выдающиеся советские авиаторы Великой Отечественной войны	12</w:t>
-      </w:r>
-    </w:p>
-    <w:p>
-      <w:pPr>
-        <w:tabs>
-          <w:tab w:val="right" w:pos="9355" w:leader="dot"/>
-        </w:tabs>
-        <w:spacing w:after="80"/>
-        <w:ind w:left="0" w:right="500"/>
-        <w:outlineLvl w:val="9"/>
-      </w:pPr>
-      <w:r>
-        <w:rPr>
-          <w:rFonts w:ascii="Times New Roman" w:cs="Times New Roman" w:eastAsia="Times New Roman" w:hAnsi="Times New Roman"/>
-          <w:sz w:val="28"/>
-          <w:szCs w:val="28"/>
-        </w:rPr>
-        <w:t xml:space="preserve">ПРИЛОЖЕНИЕ Б Анкета для обучающихся	13</w:t>
-      </w:r>
-    </w:p>
-    <w:p>
-      <w:pPr>
-        <w:tabs>
-          <w:tab w:val="right" w:pos="9355" w:leader="dot"/>
-        </w:tabs>
-        <w:spacing w:after="80"/>
-        <w:ind w:left="0" w:right="500"/>
-        <w:outlineLvl w:val="9"/>
-      </w:pPr>
-      <w:r>
-        <w:rPr>
-          <w:rFonts w:ascii="Times New Roman" w:cs="Times New Roman" w:eastAsia="Times New Roman" w:hAnsi="Times New Roman"/>
-          <w:sz w:val="28"/>
-          <w:szCs w:val="28"/>
-        </w:rPr>
-        <w:t xml:space="preserve">ПРИЛОЖЕНИЕ В Информационная памятка «Крылья Победы»	14</w:t>
+        <w:t xml:space="preserve">ПРИЛОЖЕНИЕ Б Информационная памятка «Крылья Победы»	12</w:t>
       </w:r>
     </w:p>
     <w:p>
@@ -824,7 +788,7 @@
           <w:sz w:val="28"/>
           <w:szCs w:val="28"/>
         </w:rPr>
-        <w:t xml:space="preserve">Цель проекта – изучить роль советской авиации в достижении победы в Великой Отечественной войне и выявить уровень знаний обучающихся об авиаторах и боевой авиационной технике военных лет.</w:t>
+        <w:t xml:space="preserve">Цель проекта – изучить роль советской авиации в достижении победы в Великой Отечественной войне и подготовить информационный материал о подвигах советских авиаторов.</w:t>
       </w:r>
     </w:p>
     <w:p>
@@ -932,7 +896,7 @@
           <w:sz w:val="28"/>
           <w:szCs w:val="28"/>
         </w:rPr>
-        <w:t xml:space="preserve">5) провести анкетирование обучающихся и сформулировать выводы по результатам исследования.</w:t>
+        <w:t xml:space="preserve">5) разработать информационную памятку «Крылья Победы» и сформулировать выводы по результатам исследования.</w:t>
       </w:r>
     </w:p>
     <w:p>
@@ -986,7 +950,7 @@
           <w:sz w:val="28"/>
           <w:szCs w:val="28"/>
         </w:rPr>
-        <w:t xml:space="preserve">Методы исследования: анализ научной, мемуарной и справочной литературы; сравнение и обобщение; систематизация сведений; анкетирование; обработка и анализ полученных данных.</w:t>
+        <w:t xml:space="preserve">Методы исследования: анализ научной, мемуарной и справочной литературы; сравнение и обобщение; систематизация и обобщение полученных сведений.</w:t>
       </w:r>
     </w:p>
     <w:p>
@@ -2916,874 +2880,20 @@
     </w:p>
     <w:p>
       <w:pPr>
-        <w:keepNext/>
-        <w:spacing w:after="240" w:before="240"/>
-        <w:ind w:firstLine="709"/>
-        <w:jc w:val="both"/>
-        <w:outlineLvl w:val="9"/>
-      </w:pPr>
-      <w:r>
-        <w:rPr>
-          <w:rFonts w:ascii="Times New Roman" w:cs="Times New Roman" w:eastAsia="Times New Roman" w:hAnsi="Times New Roman"/>
-          <w:b/>
-          <w:bCs/>
-          <w:sz w:val="28"/>
-          <w:szCs w:val="28"/>
-        </w:rPr>
-        <w:t xml:space="preserve">2.3 Анкетирование обучающихся</w:t>
-      </w:r>
-    </w:p>
-    <w:p>
-      <w:pPr>
-        <w:spacing w:after="0" w:line="240"/>
-        <w:ind w:firstLine="709"/>
-        <w:jc w:val="both"/>
-        <w:outlineLvl w:val="9"/>
-      </w:pPr>
-      <w:r>
-        <w:rPr>
-          <w:rFonts w:ascii="Times New Roman" w:cs="Times New Roman" w:eastAsia="Times New Roman" w:hAnsi="Times New Roman"/>
-          <w:b w:val="false"/>
-          <w:bCs w:val="false"/>
-          <w:sz w:val="28"/>
-          <w:szCs w:val="28"/>
-          <w:highlight w:val="yellow"/>
-        </w:rPr>
-        <w:t xml:space="preserve">С целью выявления уровня знаний об истории военной авиации периода Великой Отечественной войны было проведено анкетирование обучающихся факультета среднего профессионального образования. В опросе приняли участие [_] человек. Анкета включала 8 вопросов (приложение Б).</w:t>
-      </w:r>
-    </w:p>
-    <w:p>
-      <w:pPr>
-        <w:spacing w:after="0" w:line="240"/>
-        <w:ind w:firstLine="709"/>
-        <w:jc w:val="both"/>
-        <w:outlineLvl w:val="9"/>
-      </w:pPr>
-      <w:r>
-        <w:rPr>
-          <w:rFonts w:ascii="Times New Roman" w:cs="Times New Roman" w:eastAsia="Times New Roman" w:hAnsi="Times New Roman"/>
-          <w:b w:val="false"/>
-          <w:bCs w:val="false"/>
-          <w:sz w:val="28"/>
-          <w:szCs w:val="28"/>
-          <w:highlight w:val="yellow"/>
-        </w:rPr>
-        <w:t xml:space="preserve">Результаты анкетирования представлены в таблице 2.</w:t>
-      </w:r>
-    </w:p>
-    <w:p>
-      <w:pPr>
-        <w:keepNext/>
-        <w:spacing w:after="120" w:before="120"/>
-        <w:jc w:val="left"/>
-        <w:outlineLvl w:val="9"/>
-      </w:pPr>
-      <w:r>
-        <w:rPr>
-          <w:rFonts w:ascii="Times New Roman" w:cs="Times New Roman" w:eastAsia="Times New Roman" w:hAnsi="Times New Roman"/>
-          <w:sz w:val="28"/>
-          <w:szCs w:val="28"/>
-        </w:rPr>
-        <w:t xml:space="preserve">Таблица 2 – Результаты анкетирования обучающихся</w:t>
-      </w:r>
-    </w:p>
-    <w:tbl>
-      <w:tblPr>
-        <w:tblW w:type="dxa" w:w="9354"/>
-        <w:tblBorders>
-          <w:top w:val="single" w:color="auto" w:sz="4"/>
-          <w:left w:val="single" w:color="auto" w:sz="4"/>
-          <w:bottom w:val="single" w:color="auto" w:sz="4"/>
-          <w:right w:val="single" w:color="auto" w:sz="4"/>
-          <w:insideH w:val="single" w:color="auto" w:sz="4"/>
-          <w:insideV w:val="single" w:color="auto" w:sz="4"/>
-        </w:tblBorders>
-      </w:tblPr>
-      <w:tblGrid>
-        <w:gridCol w:w="5354"/>
-        <w:gridCol w:w="2000"/>
-        <w:gridCol w:w="2000"/>
-      </w:tblGrid>
-      <w:tr>
-        <w:trPr>
-          <w:tblHeader/>
-        </w:trPr>
-        <w:tc>
-          <w:tcPr>
-            <w:tcW w:type="dxa" w:w="5354"/>
-            <w:tcBorders>
-              <w:top w:val="single" w:color="000000" w:sz="4"/>
-              <w:left w:val="single" w:color="000000" w:sz="4"/>
-              <w:bottom w:val="single" w:color="000000" w:sz="4"/>
-              <w:right w:val="single" w:color="000000" w:sz="4"/>
-            </w:tcBorders>
-            <w:shd w:fill="E7E7E7" w:color="auto" w:val="clear"/>
-            <w:tcMar>
-              <w:top w:type="dxa" w:w="40"/>
-              <w:left w:type="dxa" w:w="80"/>
-              <w:bottom w:type="dxa" w:w="40"/>
-              <w:right w:type="dxa" w:w="80"/>
-            </w:tcMar>
-            <w:vAlign w:val="center"/>
-          </w:tcPr>
-          <w:p>
-            <w:pPr>
-              <w:jc w:val="center"/>
-              <w:outlineLvl w:val="9"/>
-            </w:pPr>
-            <w:r>
-              <w:rPr>
-                <w:rFonts w:ascii="Times New Roman" w:cs="Times New Roman" w:eastAsia="Times New Roman" w:hAnsi="Times New Roman"/>
-                <w:b/>
-                <w:bCs/>
-                <w:sz w:val="24"/>
-                <w:szCs w:val="24"/>
-              </w:rPr>
-              <w:t xml:space="preserve">Вопрос</w:t>
-            </w:r>
-          </w:p>
-        </w:tc>
-        <w:tc>
-          <w:tcPr>
-            <w:tcW w:type="dxa" w:w="2000"/>
-            <w:tcBorders>
-              <w:top w:val="single" w:color="000000" w:sz="4"/>
-              <w:left w:val="single" w:color="000000" w:sz="4"/>
-              <w:bottom w:val="single" w:color="000000" w:sz="4"/>
-              <w:right w:val="single" w:color="000000" w:sz="4"/>
-            </w:tcBorders>
-            <w:shd w:fill="E7E7E7" w:color="auto" w:val="clear"/>
-            <w:tcMar>
-              <w:top w:type="dxa" w:w="40"/>
-              <w:left w:type="dxa" w:w="80"/>
-              <w:bottom w:type="dxa" w:w="40"/>
-              <w:right w:type="dxa" w:w="80"/>
-            </w:tcMar>
-            <w:vAlign w:val="center"/>
-          </w:tcPr>
-          <w:p>
-            <w:pPr>
-              <w:jc w:val="center"/>
-              <w:outlineLvl w:val="9"/>
-            </w:pPr>
-            <w:r>
-              <w:rPr>
-                <w:rFonts w:ascii="Times New Roman" w:cs="Times New Roman" w:eastAsia="Times New Roman" w:hAnsi="Times New Roman"/>
-                <w:b/>
-                <w:bCs/>
-                <w:sz w:val="24"/>
-                <w:szCs w:val="24"/>
-              </w:rPr>
-              <w:t xml:space="preserve">Ответили верно, чел.</w:t>
-            </w:r>
-          </w:p>
-        </w:tc>
-        <w:tc>
-          <w:tcPr>
-            <w:tcW w:type="dxa" w:w="2000"/>
-            <w:tcBorders>
-              <w:top w:val="single" w:color="000000" w:sz="4"/>
-              <w:left w:val="single" w:color="000000" w:sz="4"/>
-              <w:bottom w:val="single" w:color="000000" w:sz="4"/>
-              <w:right w:val="single" w:color="000000" w:sz="4"/>
-            </w:tcBorders>
-            <w:shd w:fill="E7E7E7" w:color="auto" w:val="clear"/>
-            <w:tcMar>
-              <w:top w:type="dxa" w:w="40"/>
-              <w:left w:type="dxa" w:w="80"/>
-              <w:bottom w:type="dxa" w:w="40"/>
-              <w:right w:type="dxa" w:w="80"/>
-            </w:tcMar>
-            <w:vAlign w:val="center"/>
-          </w:tcPr>
-          <w:p>
-            <w:pPr>
-              <w:jc w:val="center"/>
-              <w:outlineLvl w:val="9"/>
-            </w:pPr>
-            <w:r>
-              <w:rPr>
-                <w:rFonts w:ascii="Times New Roman" w:cs="Times New Roman" w:eastAsia="Times New Roman" w:hAnsi="Times New Roman"/>
-                <w:b/>
-                <w:bCs/>
-                <w:sz w:val="24"/>
-                <w:szCs w:val="24"/>
-              </w:rPr>
-              <w:t xml:space="preserve">Ответили верно, %</w:t>
-            </w:r>
-          </w:p>
-        </w:tc>
-      </w:tr>
-      <w:tr>
-        <w:tc>
-          <w:tcPr>
-            <w:tcW w:type="dxa" w:w="5354"/>
-            <w:tcBorders>
-              <w:top w:val="single" w:color="000000" w:sz="4"/>
-              <w:left w:val="single" w:color="000000" w:sz="4"/>
-              <w:bottom w:val="single" w:color="000000" w:sz="4"/>
-              <w:right w:val="single" w:color="000000" w:sz="4"/>
-            </w:tcBorders>
-            <w:tcMar>
-              <w:top w:type="dxa" w:w="40"/>
-              <w:left w:type="dxa" w:w="80"/>
-              <w:bottom w:type="dxa" w:w="40"/>
-              <w:right w:type="dxa" w:w="80"/>
-            </w:tcMar>
-            <w:vAlign w:val="center"/>
-          </w:tcPr>
-          <w:p>
-            <w:pPr>
-              <w:jc w:val="left"/>
-              <w:outlineLvl w:val="9"/>
-            </w:pPr>
-            <w:r>
-              <w:rPr>
-                <w:rFonts w:ascii="Times New Roman" w:cs="Times New Roman" w:eastAsia="Times New Roman" w:hAnsi="Times New Roman"/>
-                <w:b w:val="false"/>
-                <w:bCs w:val="false"/>
-                <w:sz w:val="24"/>
-                <w:szCs w:val="24"/>
-              </w:rPr>
-              <w:t xml:space="preserve">Какой самолёт называли «летающим танком»?</w:t>
-            </w:r>
-          </w:p>
-        </w:tc>
-        <w:tc>
-          <w:tcPr>
-            <w:tcW w:type="dxa" w:w="2000"/>
-            <w:tcBorders>
-              <w:top w:val="single" w:color="000000" w:sz="4"/>
-              <w:left w:val="single" w:color="000000" w:sz="4"/>
-              <w:bottom w:val="single" w:color="000000" w:sz="4"/>
-              <w:right w:val="single" w:color="000000" w:sz="4"/>
-            </w:tcBorders>
-            <w:tcMar>
-              <w:top w:type="dxa" w:w="40"/>
-              <w:left w:type="dxa" w:w="80"/>
-              <w:bottom w:type="dxa" w:w="40"/>
-              <w:right w:type="dxa" w:w="80"/>
-            </w:tcMar>
-            <w:vAlign w:val="center"/>
-          </w:tcPr>
-          <w:p>
-            <w:pPr>
-              <w:jc w:val="left"/>
-              <w:outlineLvl w:val="9"/>
-            </w:pPr>
-            <w:r>
-              <w:rPr>
-                <w:rFonts w:ascii="Times New Roman" w:cs="Times New Roman" w:eastAsia="Times New Roman" w:hAnsi="Times New Roman"/>
-                <w:b w:val="false"/>
-                <w:bCs w:val="false"/>
-                <w:sz w:val="24"/>
-                <w:szCs w:val="24"/>
-              </w:rPr>
-              <w:t xml:space="preserve"/>
-            </w:r>
-          </w:p>
-        </w:tc>
-        <w:tc>
-          <w:tcPr>
-            <w:tcW w:type="dxa" w:w="2000"/>
-            <w:tcBorders>
-              <w:top w:val="single" w:color="000000" w:sz="4"/>
-              <w:left w:val="single" w:color="000000" w:sz="4"/>
-              <w:bottom w:val="single" w:color="000000" w:sz="4"/>
-              <w:right w:val="single" w:color="000000" w:sz="4"/>
-            </w:tcBorders>
-            <w:tcMar>
-              <w:top w:type="dxa" w:w="40"/>
-              <w:left w:type="dxa" w:w="80"/>
-              <w:bottom w:type="dxa" w:w="40"/>
-              <w:right w:type="dxa" w:w="80"/>
-            </w:tcMar>
-            <w:vAlign w:val="center"/>
-          </w:tcPr>
-          <w:p>
-            <w:pPr>
-              <w:jc w:val="left"/>
-              <w:outlineLvl w:val="9"/>
-            </w:pPr>
-            <w:r>
-              <w:rPr>
-                <w:rFonts w:ascii="Times New Roman" w:cs="Times New Roman" w:eastAsia="Times New Roman" w:hAnsi="Times New Roman"/>
-                <w:b w:val="false"/>
-                <w:bCs w:val="false"/>
-                <w:sz w:val="24"/>
-                <w:szCs w:val="24"/>
-              </w:rPr>
-              <w:t xml:space="preserve"/>
-            </w:r>
-          </w:p>
-        </w:tc>
-      </w:tr>
-      <w:tr>
-        <w:tc>
-          <w:tcPr>
-            <w:tcW w:type="dxa" w:w="5354"/>
-            <w:tcBorders>
-              <w:top w:val="single" w:color="000000" w:sz="4"/>
-              <w:left w:val="single" w:color="000000" w:sz="4"/>
-              <w:bottom w:val="single" w:color="000000" w:sz="4"/>
-              <w:right w:val="single" w:color="000000" w:sz="4"/>
-            </w:tcBorders>
-            <w:tcMar>
-              <w:top w:type="dxa" w:w="40"/>
-              <w:left w:type="dxa" w:w="80"/>
-              <w:bottom w:type="dxa" w:w="40"/>
-              <w:right w:type="dxa" w:w="80"/>
-            </w:tcMar>
-            <w:vAlign w:val="center"/>
-          </w:tcPr>
-          <w:p>
-            <w:pPr>
-              <w:jc w:val="left"/>
-              <w:outlineLvl w:val="9"/>
-            </w:pPr>
-            <w:r>
-              <w:rPr>
-                <w:rFonts w:ascii="Times New Roman" w:cs="Times New Roman" w:eastAsia="Times New Roman" w:hAnsi="Times New Roman"/>
-                <w:b w:val="false"/>
-                <w:bCs w:val="false"/>
-                <w:sz w:val="24"/>
-                <w:szCs w:val="24"/>
-              </w:rPr>
-              <w:t xml:space="preserve">Кто из лётчиков трижды стал Героем Советского Союза?</w:t>
-            </w:r>
-          </w:p>
-        </w:tc>
-        <w:tc>
-          <w:tcPr>
-            <w:tcW w:type="dxa" w:w="2000"/>
-            <w:tcBorders>
-              <w:top w:val="single" w:color="000000" w:sz="4"/>
-              <w:left w:val="single" w:color="000000" w:sz="4"/>
-              <w:bottom w:val="single" w:color="000000" w:sz="4"/>
-              <w:right w:val="single" w:color="000000" w:sz="4"/>
-            </w:tcBorders>
-            <w:tcMar>
-              <w:top w:type="dxa" w:w="40"/>
-              <w:left w:type="dxa" w:w="80"/>
-              <w:bottom w:type="dxa" w:w="40"/>
-              <w:right w:type="dxa" w:w="80"/>
-            </w:tcMar>
-            <w:vAlign w:val="center"/>
-          </w:tcPr>
-          <w:p>
-            <w:pPr>
-              <w:jc w:val="left"/>
-              <w:outlineLvl w:val="9"/>
-            </w:pPr>
-            <w:r>
-              <w:rPr>
-                <w:rFonts w:ascii="Times New Roman" w:cs="Times New Roman" w:eastAsia="Times New Roman" w:hAnsi="Times New Roman"/>
-                <w:b w:val="false"/>
-                <w:bCs w:val="false"/>
-                <w:sz w:val="24"/>
-                <w:szCs w:val="24"/>
-              </w:rPr>
-              <w:t xml:space="preserve"/>
-            </w:r>
-          </w:p>
-        </w:tc>
-        <w:tc>
-          <w:tcPr>
-            <w:tcW w:type="dxa" w:w="2000"/>
-            <w:tcBorders>
-              <w:top w:val="single" w:color="000000" w:sz="4"/>
-              <w:left w:val="single" w:color="000000" w:sz="4"/>
-              <w:bottom w:val="single" w:color="000000" w:sz="4"/>
-              <w:right w:val="single" w:color="000000" w:sz="4"/>
-            </w:tcBorders>
-            <w:tcMar>
-              <w:top w:type="dxa" w:w="40"/>
-              <w:left w:type="dxa" w:w="80"/>
-              <w:bottom w:type="dxa" w:w="40"/>
-              <w:right w:type="dxa" w:w="80"/>
-            </w:tcMar>
-            <w:vAlign w:val="center"/>
-          </w:tcPr>
-          <w:p>
-            <w:pPr>
-              <w:jc w:val="left"/>
-              <w:outlineLvl w:val="9"/>
-            </w:pPr>
-            <w:r>
-              <w:rPr>
-                <w:rFonts w:ascii="Times New Roman" w:cs="Times New Roman" w:eastAsia="Times New Roman" w:hAnsi="Times New Roman"/>
-                <w:b w:val="false"/>
-                <w:bCs w:val="false"/>
-                <w:sz w:val="24"/>
-                <w:szCs w:val="24"/>
-              </w:rPr>
-              <w:t xml:space="preserve"/>
-            </w:r>
-          </w:p>
-        </w:tc>
-      </w:tr>
-      <w:tr>
-        <w:tc>
-          <w:tcPr>
-            <w:tcW w:type="dxa" w:w="5354"/>
-            <w:tcBorders>
-              <w:top w:val="single" w:color="000000" w:sz="4"/>
-              <w:left w:val="single" w:color="000000" w:sz="4"/>
-              <w:bottom w:val="single" w:color="000000" w:sz="4"/>
-              <w:right w:val="single" w:color="000000" w:sz="4"/>
-            </w:tcBorders>
-            <w:tcMar>
-              <w:top w:type="dxa" w:w="40"/>
-              <w:left w:type="dxa" w:w="80"/>
-              <w:bottom w:type="dxa" w:w="40"/>
-              <w:right w:type="dxa" w:w="80"/>
-            </w:tcMar>
-            <w:vAlign w:val="center"/>
-          </w:tcPr>
-          <w:p>
-            <w:pPr>
-              <w:jc w:val="left"/>
-              <w:outlineLvl w:val="9"/>
-            </w:pPr>
-            <w:r>
-              <w:rPr>
-                <w:rFonts w:ascii="Times New Roman" w:cs="Times New Roman" w:eastAsia="Times New Roman" w:hAnsi="Times New Roman"/>
-                <w:b w:val="false"/>
-                <w:bCs w:val="false"/>
-                <w:sz w:val="24"/>
-                <w:szCs w:val="24"/>
-              </w:rPr>
-              <w:t xml:space="preserve">Как немцы называли лётчиц 46-го гвардейского полка?</w:t>
-            </w:r>
-          </w:p>
-        </w:tc>
-        <w:tc>
-          <w:tcPr>
-            <w:tcW w:type="dxa" w:w="2000"/>
-            <w:tcBorders>
-              <w:top w:val="single" w:color="000000" w:sz="4"/>
-              <w:left w:val="single" w:color="000000" w:sz="4"/>
-              <w:bottom w:val="single" w:color="000000" w:sz="4"/>
-              <w:right w:val="single" w:color="000000" w:sz="4"/>
-            </w:tcBorders>
-            <w:tcMar>
-              <w:top w:type="dxa" w:w="40"/>
-              <w:left w:type="dxa" w:w="80"/>
-              <w:bottom w:type="dxa" w:w="40"/>
-              <w:right w:type="dxa" w:w="80"/>
-            </w:tcMar>
-            <w:vAlign w:val="center"/>
-          </w:tcPr>
-          <w:p>
-            <w:pPr>
-              <w:jc w:val="left"/>
-              <w:outlineLvl w:val="9"/>
-            </w:pPr>
-            <w:r>
-              <w:rPr>
-                <w:rFonts w:ascii="Times New Roman" w:cs="Times New Roman" w:eastAsia="Times New Roman" w:hAnsi="Times New Roman"/>
-                <w:b w:val="false"/>
-                <w:bCs w:val="false"/>
-                <w:sz w:val="24"/>
-                <w:szCs w:val="24"/>
-              </w:rPr>
-              <w:t xml:space="preserve"/>
-            </w:r>
-          </w:p>
-        </w:tc>
-        <w:tc>
-          <w:tcPr>
-            <w:tcW w:type="dxa" w:w="2000"/>
-            <w:tcBorders>
-              <w:top w:val="single" w:color="000000" w:sz="4"/>
-              <w:left w:val="single" w:color="000000" w:sz="4"/>
-              <w:bottom w:val="single" w:color="000000" w:sz="4"/>
-              <w:right w:val="single" w:color="000000" w:sz="4"/>
-            </w:tcBorders>
-            <w:tcMar>
-              <w:top w:type="dxa" w:w="40"/>
-              <w:left w:type="dxa" w:w="80"/>
-              <w:bottom w:type="dxa" w:w="40"/>
-              <w:right w:type="dxa" w:w="80"/>
-            </w:tcMar>
-            <w:vAlign w:val="center"/>
-          </w:tcPr>
-          <w:p>
-            <w:pPr>
-              <w:jc w:val="left"/>
-              <w:outlineLvl w:val="9"/>
-            </w:pPr>
-            <w:r>
-              <w:rPr>
-                <w:rFonts w:ascii="Times New Roman" w:cs="Times New Roman" w:eastAsia="Times New Roman" w:hAnsi="Times New Roman"/>
-                <w:b w:val="false"/>
-                <w:bCs w:val="false"/>
-                <w:sz w:val="24"/>
-                <w:szCs w:val="24"/>
-              </w:rPr>
-              <w:t xml:space="preserve"/>
-            </w:r>
-          </w:p>
-        </w:tc>
-      </w:tr>
-      <w:tr>
-        <w:tc>
-          <w:tcPr>
-            <w:tcW w:type="dxa" w:w="5354"/>
-            <w:tcBorders>
-              <w:top w:val="single" w:color="000000" w:sz="4"/>
-              <w:left w:val="single" w:color="000000" w:sz="4"/>
-              <w:bottom w:val="single" w:color="000000" w:sz="4"/>
-              <w:right w:val="single" w:color="000000" w:sz="4"/>
-            </w:tcBorders>
-            <w:tcMar>
-              <w:top w:type="dxa" w:w="40"/>
-              <w:left w:type="dxa" w:w="80"/>
-              <w:bottom w:type="dxa" w:w="40"/>
-              <w:right w:type="dxa" w:w="80"/>
-            </w:tcMar>
-            <w:vAlign w:val="center"/>
-          </w:tcPr>
-          <w:p>
-            <w:pPr>
-              <w:jc w:val="left"/>
-              <w:outlineLvl w:val="9"/>
-            </w:pPr>
-            <w:r>
-              <w:rPr>
-                <w:rFonts w:ascii="Times New Roman" w:cs="Times New Roman" w:eastAsia="Times New Roman" w:hAnsi="Times New Roman"/>
-                <w:b w:val="false"/>
-                <w:bCs w:val="false"/>
-                <w:sz w:val="24"/>
-                <w:szCs w:val="24"/>
-              </w:rPr>
-              <w:t xml:space="preserve">О каком лётчике написана «Повесть о настоящем человеке»?</w:t>
-            </w:r>
-          </w:p>
-        </w:tc>
-        <w:tc>
-          <w:tcPr>
-            <w:tcW w:type="dxa" w:w="2000"/>
-            <w:tcBorders>
-              <w:top w:val="single" w:color="000000" w:sz="4"/>
-              <w:left w:val="single" w:color="000000" w:sz="4"/>
-              <w:bottom w:val="single" w:color="000000" w:sz="4"/>
-              <w:right w:val="single" w:color="000000" w:sz="4"/>
-            </w:tcBorders>
-            <w:tcMar>
-              <w:top w:type="dxa" w:w="40"/>
-              <w:left w:type="dxa" w:w="80"/>
-              <w:bottom w:type="dxa" w:w="40"/>
-              <w:right w:type="dxa" w:w="80"/>
-            </w:tcMar>
-            <w:vAlign w:val="center"/>
-          </w:tcPr>
-          <w:p>
-            <w:pPr>
-              <w:jc w:val="left"/>
-              <w:outlineLvl w:val="9"/>
-            </w:pPr>
-            <w:r>
-              <w:rPr>
-                <w:rFonts w:ascii="Times New Roman" w:cs="Times New Roman" w:eastAsia="Times New Roman" w:hAnsi="Times New Roman"/>
-                <w:b w:val="false"/>
-                <w:bCs w:val="false"/>
-                <w:sz w:val="24"/>
-                <w:szCs w:val="24"/>
-              </w:rPr>
-              <w:t xml:space="preserve"/>
-            </w:r>
-          </w:p>
-        </w:tc>
-        <w:tc>
-          <w:tcPr>
-            <w:tcW w:type="dxa" w:w="2000"/>
-            <w:tcBorders>
-              <w:top w:val="single" w:color="000000" w:sz="4"/>
-              <w:left w:val="single" w:color="000000" w:sz="4"/>
-              <w:bottom w:val="single" w:color="000000" w:sz="4"/>
-              <w:right w:val="single" w:color="000000" w:sz="4"/>
-            </w:tcBorders>
-            <w:tcMar>
-              <w:top w:type="dxa" w:w="40"/>
-              <w:left w:type="dxa" w:w="80"/>
-              <w:bottom w:type="dxa" w:w="40"/>
-              <w:right w:type="dxa" w:w="80"/>
-            </w:tcMar>
-            <w:vAlign w:val="center"/>
-          </w:tcPr>
-          <w:p>
-            <w:pPr>
-              <w:jc w:val="left"/>
-              <w:outlineLvl w:val="9"/>
-            </w:pPr>
-            <w:r>
-              <w:rPr>
-                <w:rFonts w:ascii="Times New Roman" w:cs="Times New Roman" w:eastAsia="Times New Roman" w:hAnsi="Times New Roman"/>
-                <w:b w:val="false"/>
-                <w:bCs w:val="false"/>
-                <w:sz w:val="24"/>
-                <w:szCs w:val="24"/>
-              </w:rPr>
-              <w:t xml:space="preserve"/>
-            </w:r>
-          </w:p>
-        </w:tc>
-      </w:tr>
-      <w:tr>
-        <w:tc>
-          <w:tcPr>
-            <w:tcW w:type="dxa" w:w="5354"/>
-            <w:tcBorders>
-              <w:top w:val="single" w:color="000000" w:sz="4"/>
-              <w:left w:val="single" w:color="000000" w:sz="4"/>
-              <w:bottom w:val="single" w:color="000000" w:sz="4"/>
-              <w:right w:val="single" w:color="000000" w:sz="4"/>
-            </w:tcBorders>
-            <w:tcMar>
-              <w:top w:type="dxa" w:w="40"/>
-              <w:left w:type="dxa" w:w="80"/>
-              <w:bottom w:type="dxa" w:w="40"/>
-              <w:right w:type="dxa" w:w="80"/>
-            </w:tcMar>
-            <w:vAlign w:val="center"/>
-          </w:tcPr>
-          <w:p>
-            <w:pPr>
-              <w:jc w:val="left"/>
-              <w:outlineLvl w:val="9"/>
-            </w:pPr>
-            <w:r>
-              <w:rPr>
-                <w:rFonts w:ascii="Times New Roman" w:cs="Times New Roman" w:eastAsia="Times New Roman" w:hAnsi="Times New Roman"/>
-                <w:b w:val="false"/>
-                <w:bCs w:val="false"/>
-                <w:sz w:val="24"/>
-                <w:szCs w:val="24"/>
-              </w:rPr>
-              <w:t xml:space="preserve">Кто совершил один из первых ночных таранов над Москвой?</w:t>
-            </w:r>
-          </w:p>
-        </w:tc>
-        <w:tc>
-          <w:tcPr>
-            <w:tcW w:type="dxa" w:w="2000"/>
-            <w:tcBorders>
-              <w:top w:val="single" w:color="000000" w:sz="4"/>
-              <w:left w:val="single" w:color="000000" w:sz="4"/>
-              <w:bottom w:val="single" w:color="000000" w:sz="4"/>
-              <w:right w:val="single" w:color="000000" w:sz="4"/>
-            </w:tcBorders>
-            <w:tcMar>
-              <w:top w:type="dxa" w:w="40"/>
-              <w:left w:type="dxa" w:w="80"/>
-              <w:bottom w:type="dxa" w:w="40"/>
-              <w:right w:type="dxa" w:w="80"/>
-            </w:tcMar>
-            <w:vAlign w:val="center"/>
-          </w:tcPr>
-          <w:p>
-            <w:pPr>
-              <w:jc w:val="left"/>
-              <w:outlineLvl w:val="9"/>
-            </w:pPr>
-            <w:r>
-              <w:rPr>
-                <w:rFonts w:ascii="Times New Roman" w:cs="Times New Roman" w:eastAsia="Times New Roman" w:hAnsi="Times New Roman"/>
-                <w:b w:val="false"/>
-                <w:bCs w:val="false"/>
-                <w:sz w:val="24"/>
-                <w:szCs w:val="24"/>
-              </w:rPr>
-              <w:t xml:space="preserve"/>
-            </w:r>
-          </w:p>
-        </w:tc>
-        <w:tc>
-          <w:tcPr>
-            <w:tcW w:type="dxa" w:w="2000"/>
-            <w:tcBorders>
-              <w:top w:val="single" w:color="000000" w:sz="4"/>
-              <w:left w:val="single" w:color="000000" w:sz="4"/>
-              <w:bottom w:val="single" w:color="000000" w:sz="4"/>
-              <w:right w:val="single" w:color="000000" w:sz="4"/>
-            </w:tcBorders>
-            <w:tcMar>
-              <w:top w:type="dxa" w:w="40"/>
-              <w:left w:type="dxa" w:w="80"/>
-              <w:bottom w:type="dxa" w:w="40"/>
-              <w:right w:type="dxa" w:w="80"/>
-            </w:tcMar>
-            <w:vAlign w:val="center"/>
-          </w:tcPr>
-          <w:p>
-            <w:pPr>
-              <w:jc w:val="left"/>
-              <w:outlineLvl w:val="9"/>
-            </w:pPr>
-            <w:r>
-              <w:rPr>
-                <w:rFonts w:ascii="Times New Roman" w:cs="Times New Roman" w:eastAsia="Times New Roman" w:hAnsi="Times New Roman"/>
-                <w:b w:val="false"/>
-                <w:bCs w:val="false"/>
-                <w:sz w:val="24"/>
-                <w:szCs w:val="24"/>
-              </w:rPr>
-              <w:t xml:space="preserve"/>
-            </w:r>
-          </w:p>
-        </w:tc>
-      </w:tr>
-      <w:tr>
-        <w:tc>
-          <w:tcPr>
-            <w:tcW w:type="dxa" w:w="5354"/>
-            <w:tcBorders>
-              <w:top w:val="single" w:color="000000" w:sz="4"/>
-              <w:left w:val="single" w:color="000000" w:sz="4"/>
-              <w:bottom w:val="single" w:color="000000" w:sz="4"/>
-              <w:right w:val="single" w:color="000000" w:sz="4"/>
-            </w:tcBorders>
-            <w:tcMar>
-              <w:top w:type="dxa" w:w="40"/>
-              <w:left w:type="dxa" w:w="80"/>
-              <w:bottom w:type="dxa" w:w="40"/>
-              <w:right w:type="dxa" w:w="80"/>
-            </w:tcMar>
-            <w:vAlign w:val="center"/>
-          </w:tcPr>
-          <w:p>
-            <w:pPr>
-              <w:jc w:val="left"/>
-              <w:outlineLvl w:val="9"/>
-            </w:pPr>
-            <w:r>
-              <w:rPr>
-                <w:rFonts w:ascii="Times New Roman" w:cs="Times New Roman" w:eastAsia="Times New Roman" w:hAnsi="Times New Roman"/>
-                <w:b w:val="false"/>
-                <w:bCs w:val="false"/>
-                <w:sz w:val="24"/>
-                <w:szCs w:val="24"/>
-              </w:rPr>
-              <w:t xml:space="preserve">В каком сражении советская авиация окончательно завоевала господство в воздухе?</w:t>
-            </w:r>
-          </w:p>
-        </w:tc>
-        <w:tc>
-          <w:tcPr>
-            <w:tcW w:type="dxa" w:w="2000"/>
-            <w:tcBorders>
-              <w:top w:val="single" w:color="000000" w:sz="4"/>
-              <w:left w:val="single" w:color="000000" w:sz="4"/>
-              <w:bottom w:val="single" w:color="000000" w:sz="4"/>
-              <w:right w:val="single" w:color="000000" w:sz="4"/>
-            </w:tcBorders>
-            <w:tcMar>
-              <w:top w:type="dxa" w:w="40"/>
-              <w:left w:type="dxa" w:w="80"/>
-              <w:bottom w:type="dxa" w:w="40"/>
-              <w:right w:type="dxa" w:w="80"/>
-            </w:tcMar>
-            <w:vAlign w:val="center"/>
-          </w:tcPr>
-          <w:p>
-            <w:pPr>
-              <w:jc w:val="left"/>
-              <w:outlineLvl w:val="9"/>
-            </w:pPr>
-            <w:r>
-              <w:rPr>
-                <w:rFonts w:ascii="Times New Roman" w:cs="Times New Roman" w:eastAsia="Times New Roman" w:hAnsi="Times New Roman"/>
-                <w:b w:val="false"/>
-                <w:bCs w:val="false"/>
-                <w:sz w:val="24"/>
-                <w:szCs w:val="24"/>
-              </w:rPr>
-              <w:t xml:space="preserve"/>
-            </w:r>
-          </w:p>
-        </w:tc>
-        <w:tc>
-          <w:tcPr>
-            <w:tcW w:type="dxa" w:w="2000"/>
-            <w:tcBorders>
-              <w:top w:val="single" w:color="000000" w:sz="4"/>
-              <w:left w:val="single" w:color="000000" w:sz="4"/>
-              <w:bottom w:val="single" w:color="000000" w:sz="4"/>
-              <w:right w:val="single" w:color="000000" w:sz="4"/>
-            </w:tcBorders>
-            <w:tcMar>
-              <w:top w:type="dxa" w:w="40"/>
-              <w:left w:type="dxa" w:w="80"/>
-              <w:bottom w:type="dxa" w:w="40"/>
-              <w:right w:type="dxa" w:w="80"/>
-            </w:tcMar>
-            <w:vAlign w:val="center"/>
-          </w:tcPr>
-          <w:p>
-            <w:pPr>
-              <w:jc w:val="left"/>
-              <w:outlineLvl w:val="9"/>
-            </w:pPr>
-            <w:r>
-              <w:rPr>
-                <w:rFonts w:ascii="Times New Roman" w:cs="Times New Roman" w:eastAsia="Times New Roman" w:hAnsi="Times New Roman"/>
-                <w:b w:val="false"/>
-                <w:bCs w:val="false"/>
-                <w:sz w:val="24"/>
-                <w:szCs w:val="24"/>
-              </w:rPr>
-              <w:t xml:space="preserve"/>
-            </w:r>
-          </w:p>
-        </w:tc>
-      </w:tr>
-    </w:tbl>
-    <w:p>
-      <w:r>
-        <w:rPr>
-          <w:rFonts w:ascii="Times New Roman" w:cs="Times New Roman" w:eastAsia="Times New Roman" w:hAnsi="Times New Roman"/>
-          <w:sz w:val="28"/>
-          <w:szCs w:val="28"/>
-        </w:rPr>
-        <w:t xml:space="preserve"/>
-      </w:r>
-    </w:p>
-    <w:p>
-      <w:pPr>
-        <w:spacing w:after="0" w:line="240"/>
-        <w:ind w:firstLine="709"/>
-        <w:jc w:val="both"/>
-        <w:outlineLvl w:val="9"/>
-      </w:pPr>
-      <w:r>
-        <w:rPr>
-          <w:rFonts w:ascii="Times New Roman" w:cs="Times New Roman" w:eastAsia="Times New Roman" w:hAnsi="Times New Roman"/>
-          <w:b w:val="false"/>
-          <w:bCs w:val="false"/>
-          <w:sz w:val="28"/>
-          <w:szCs w:val="28"/>
-          <w:highlight w:val="yellow"/>
-        </w:rPr>
-        <w:t xml:space="preserve">Анализ результатов показал, что [_] % респондентов знают о штурмовике Ил-2, [_] % смогли назвать трижды Героев Советского Союза. Наименее известными оказались сведения о [_]. Полученные данные свидетельствуют о необходимости [_].</w:t>
-      </w:r>
-    </w:p>
-    <w:p>
-      <w:pPr>
-        <w:spacing w:after="0" w:line="240"/>
-        <w:ind w:firstLine="709"/>
-        <w:jc w:val="both"/>
-        <w:outlineLvl w:val="9"/>
-      </w:pPr>
-      <w:r>
-        <w:rPr>
-          <w:rFonts w:ascii="Times New Roman" w:cs="Times New Roman" w:eastAsia="Times New Roman" w:hAnsi="Times New Roman"/>
-          <w:b w:val="false"/>
-          <w:bCs w:val="false"/>
-          <w:sz w:val="28"/>
-          <w:szCs w:val="28"/>
-        </w:rPr>
-        <w:t xml:space="preserve">По итогам исследования в качестве продукта проекта подготовлена информационная памятка «Крылья Победы» (приложение В), которая может использоваться на классных часах и уроках истории.</w:t>
+        <w:spacing w:after="0" w:line="240"/>
+        <w:ind w:firstLine="709"/>
+        <w:jc w:val="both"/>
+        <w:outlineLvl w:val="9"/>
+      </w:pPr>
+      <w:r>
+        <w:rPr>
+          <w:rFonts w:ascii="Times New Roman" w:cs="Times New Roman" w:eastAsia="Times New Roman" w:hAnsi="Times New Roman"/>
+          <w:b w:val="false"/>
+          <w:bCs w:val="false"/>
+          <w:sz w:val="28"/>
+          <w:szCs w:val="28"/>
+        </w:rPr>
+        <w:t xml:space="preserve">На основе изученного материала в качестве продукта проекта подготовлена информационная памятка «Крылья Победы» (приложение Б). Она содержит наиболее яркие факты об истории советской авиации в годы войны и может использоваться на классных часах, уроках истории и мероприятиях, посвящённых Дню Победы.</w:t>
       </w:r>
     </w:p>
     <w:p>
@@ -3819,7 +2929,7 @@
           <w:sz w:val="28"/>
           <w:szCs w:val="28"/>
         </w:rPr>
-        <w:t xml:space="preserve">В ходе выполнения индивидуального проекта была достигнута поставленная цель – изучена роль советской авиации в достижении победы в Великой Отечественной войне и выявлен уровень знаний обучающихся по данной теме. Решены все поставленные задачи.</w:t>
+        <w:t xml:space="preserve">В ходе выполнения индивидуального проекта была достигнута поставленная цель – изучена роль советской авиации в достижении победы в Великой Отечественной войне и подготовлен информационный материал о подвигах советских авиаторов. Решены все поставленные задачи.</w:t>
       </w:r>
     </w:p>
     <w:p>
@@ -3909,7 +3019,7 @@
           <w:sz w:val="28"/>
           <w:szCs w:val="28"/>
         </w:rPr>
-        <w:t xml:space="preserve">В-пятых, проведено анкетирование обучающихся, по результатам которого подготовлена информационная памятка «Крылья Победы».</w:t>
+        <w:t xml:space="preserve">В-пятых, разработана информационная памятка «Крылья Победы», которая может использоваться в просветительской и патриотической работе.</w:t>
       </w:r>
     </w:p>
     <w:p>
@@ -5057,347 +4167,6 @@
           <w:szCs w:val="32"/>
         </w:rPr>
         <w:t xml:space="preserve">ПРИЛОЖЕНИЕ Б</w:t>
-      </w:r>
-    </w:p>
-    <w:p>
-      <w:pPr>
-        <w:spacing w:after="240"/>
-        <w:jc w:val="center"/>
-        <w:outlineLvl w:val="9"/>
-      </w:pPr>
-      <w:r>
-        <w:rPr>
-          <w:rFonts w:ascii="Times New Roman" w:cs="Times New Roman" w:eastAsia="Times New Roman" w:hAnsi="Times New Roman"/>
-          <w:b/>
-          <w:bCs/>
-          <w:sz w:val="28"/>
-          <w:szCs w:val="28"/>
-        </w:rPr>
-        <w:t xml:space="preserve">Анкета для обучающихся</w:t>
-      </w:r>
-    </w:p>
-    <w:p>
-      <w:pPr>
-        <w:spacing w:after="0" w:line="240"/>
-        <w:ind w:firstLine="0"/>
-        <w:jc w:val="left"/>
-        <w:outlineLvl w:val="9"/>
-      </w:pPr>
-      <w:r>
-        <w:rPr>
-          <w:rFonts w:ascii="Times New Roman" w:cs="Times New Roman" w:eastAsia="Times New Roman" w:hAnsi="Times New Roman"/>
-          <w:b w:val="false"/>
-          <w:bCs w:val="false"/>
-          <w:sz w:val="28"/>
-          <w:szCs w:val="28"/>
-        </w:rPr>
-        <w:t xml:space="preserve">Уважаемый участник! Просим ответить на вопросы анкеты. Анкетирование анонимное.</w:t>
-      </w:r>
-    </w:p>
-    <w:p>
-      <w:pPr>
-        <w:spacing w:after="0" w:line="240"/>
-        <w:ind w:firstLine="0"/>
-        <w:jc w:val="left"/>
-        <w:outlineLvl w:val="9"/>
-      </w:pPr>
-      <w:r>
-        <w:rPr>
-          <w:rFonts w:ascii="Times New Roman" w:cs="Times New Roman" w:eastAsia="Times New Roman" w:hAnsi="Times New Roman"/>
-          <w:b w:val="false"/>
-          <w:bCs w:val="false"/>
-          <w:sz w:val="28"/>
-          <w:szCs w:val="28"/>
-        </w:rPr>
-        <w:t xml:space="preserve">1. Какой советский самолёт называли «летающим танком»?</w:t>
-      </w:r>
-    </w:p>
-    <w:p>
-      <w:pPr>
-        <w:spacing w:after="0" w:line="240"/>
-        <w:ind w:firstLine="0"/>
-        <w:jc w:val="left"/>
-        <w:outlineLvl w:val="9"/>
-      </w:pPr>
-      <w:r>
-        <w:rPr>
-          <w:rFonts w:ascii="Times New Roman" w:cs="Times New Roman" w:eastAsia="Times New Roman" w:hAnsi="Times New Roman"/>
-          <w:b w:val="false"/>
-          <w:bCs w:val="false"/>
-          <w:sz w:val="28"/>
-          <w:szCs w:val="28"/>
-        </w:rPr>
-        <w:t xml:space="preserve">а) Як-3;   б) Ил-2;   в) Пе-2;   г) По-2.</w:t>
-      </w:r>
-    </w:p>
-    <w:p>
-      <w:pPr>
-        <w:spacing w:after="0" w:line="240"/>
-        <w:ind w:firstLine="0"/>
-        <w:jc w:val="left"/>
-        <w:outlineLvl w:val="9"/>
-      </w:pPr>
-      <w:r>
-        <w:rPr>
-          <w:rFonts w:ascii="Times New Roman" w:cs="Times New Roman" w:eastAsia="Times New Roman" w:hAnsi="Times New Roman"/>
-          <w:b w:val="false"/>
-          <w:bCs w:val="false"/>
-          <w:sz w:val="28"/>
-          <w:szCs w:val="28"/>
-        </w:rPr>
-        <w:t xml:space="preserve">2. Кто из лётчиков был трижды удостоен звания Героя Советского Союза?</w:t>
-      </w:r>
-    </w:p>
-    <w:p>
-      <w:pPr>
-        <w:spacing w:after="0" w:line="240"/>
-        <w:ind w:firstLine="0"/>
-        <w:jc w:val="left"/>
-        <w:outlineLvl w:val="9"/>
-      </w:pPr>
-      <w:r>
-        <w:rPr>
-          <w:rFonts w:ascii="Times New Roman" w:cs="Times New Roman" w:eastAsia="Times New Roman" w:hAnsi="Times New Roman"/>
-          <w:b w:val="false"/>
-          <w:bCs w:val="false"/>
-          <w:sz w:val="28"/>
-          <w:szCs w:val="28"/>
-        </w:rPr>
-        <w:t xml:space="preserve">а) А.П. Маресьев;   б) И.Н. Кожедуб;   в) Н.Ф. Гастелло;   г) В.П. Чкалов.</w:t>
-      </w:r>
-    </w:p>
-    <w:p>
-      <w:pPr>
-        <w:spacing w:after="0" w:line="240"/>
-        <w:ind w:firstLine="0"/>
-        <w:jc w:val="left"/>
-        <w:outlineLvl w:val="9"/>
-      </w:pPr>
-      <w:r>
-        <w:rPr>
-          <w:rFonts w:ascii="Times New Roman" w:cs="Times New Roman" w:eastAsia="Times New Roman" w:hAnsi="Times New Roman"/>
-          <w:b w:val="false"/>
-          <w:bCs w:val="false"/>
-          <w:sz w:val="28"/>
-          <w:szCs w:val="28"/>
-        </w:rPr>
-        <w:t xml:space="preserve">3. Как немецкие солдаты называли лётчиц 46-го гвардейского ночного бомбардировочного авиаполка?</w:t>
-      </w:r>
-    </w:p>
-    <w:p>
-      <w:pPr>
-        <w:spacing w:after="0" w:line="240"/>
-        <w:ind w:firstLine="0"/>
-        <w:jc w:val="left"/>
-        <w:outlineLvl w:val="9"/>
-      </w:pPr>
-      <w:r>
-        <w:rPr>
-          <w:rFonts w:ascii="Times New Roman" w:cs="Times New Roman" w:eastAsia="Times New Roman" w:hAnsi="Times New Roman"/>
-          <w:b w:val="false"/>
-          <w:bCs w:val="false"/>
-          <w:sz w:val="28"/>
-          <w:szCs w:val="28"/>
-        </w:rPr>
-        <w:t xml:space="preserve">а) «ночные ведьмы»;   б) «чёрная смерть»;   в) «соколы»;   г) «ласточки».</w:t>
-      </w:r>
-    </w:p>
-    <w:p>
-      <w:pPr>
-        <w:spacing w:after="0" w:line="240"/>
-        <w:ind w:firstLine="0"/>
-        <w:jc w:val="left"/>
-        <w:outlineLvl w:val="9"/>
-      </w:pPr>
-      <w:r>
-        <w:rPr>
-          <w:rFonts w:ascii="Times New Roman" w:cs="Times New Roman" w:eastAsia="Times New Roman" w:hAnsi="Times New Roman"/>
-          <w:b w:val="false"/>
-          <w:bCs w:val="false"/>
-          <w:sz w:val="28"/>
-          <w:szCs w:val="28"/>
-        </w:rPr>
-        <w:t xml:space="preserve">4. О каком лётчике написана «Повесть о настоящем человеке» Б.Н. Полевого?</w:t>
-      </w:r>
-    </w:p>
-    <w:p>
-      <w:pPr>
-        <w:spacing w:after="0" w:line="240"/>
-        <w:ind w:firstLine="0"/>
-        <w:jc w:val="left"/>
-        <w:outlineLvl w:val="9"/>
-      </w:pPr>
-      <w:r>
-        <w:rPr>
-          <w:rFonts w:ascii="Times New Roman" w:cs="Times New Roman" w:eastAsia="Times New Roman" w:hAnsi="Times New Roman"/>
-          <w:b w:val="false"/>
-          <w:bCs w:val="false"/>
-          <w:sz w:val="28"/>
-          <w:szCs w:val="28"/>
-        </w:rPr>
-        <w:t xml:space="preserve">а) А.И. Покрышкине;   б) В.В. Талалихине;   в) А.П. Маресьеве;   г) И.Н. Кожедубе.</w:t>
-      </w:r>
-    </w:p>
-    <w:p>
-      <w:pPr>
-        <w:spacing w:after="0" w:line="240"/>
-        <w:ind w:firstLine="0"/>
-        <w:jc w:val="left"/>
-        <w:outlineLvl w:val="9"/>
-      </w:pPr>
-      <w:r>
-        <w:rPr>
-          <w:rFonts w:ascii="Times New Roman" w:cs="Times New Roman" w:eastAsia="Times New Roman" w:hAnsi="Times New Roman"/>
-          <w:b w:val="false"/>
-          <w:bCs w:val="false"/>
-          <w:sz w:val="28"/>
-          <w:szCs w:val="28"/>
-        </w:rPr>
-        <w:t xml:space="preserve">5. Кто совершил один из первых в истории ночных таранов, защищая небо Москвы?</w:t>
-      </w:r>
-    </w:p>
-    <w:p>
-      <w:pPr>
-        <w:spacing w:after="0" w:line="240"/>
-        <w:ind w:firstLine="0"/>
-        <w:jc w:val="left"/>
-        <w:outlineLvl w:val="9"/>
-      </w:pPr>
-      <w:r>
-        <w:rPr>
-          <w:rFonts w:ascii="Times New Roman" w:cs="Times New Roman" w:eastAsia="Times New Roman" w:hAnsi="Times New Roman"/>
-          <w:b w:val="false"/>
-          <w:bCs w:val="false"/>
-          <w:sz w:val="28"/>
-          <w:szCs w:val="28"/>
-        </w:rPr>
-        <w:t xml:space="preserve">а) В.В. Талалихин;   б) Д.В. Кокорев;   в) А.И. Покрышкин;   г) М.М. Громов.</w:t>
-      </w:r>
-    </w:p>
-    <w:p>
-      <w:pPr>
-        <w:spacing w:after="0" w:line="240"/>
-        <w:ind w:firstLine="0"/>
-        <w:jc w:val="left"/>
-        <w:outlineLvl w:val="9"/>
-      </w:pPr>
-      <w:r>
-        <w:rPr>
-          <w:rFonts w:ascii="Times New Roman" w:cs="Times New Roman" w:eastAsia="Times New Roman" w:hAnsi="Times New Roman"/>
-          <w:b w:val="false"/>
-          <w:bCs w:val="false"/>
-          <w:sz w:val="28"/>
-          <w:szCs w:val="28"/>
-        </w:rPr>
-        <w:t xml:space="preserve">6. В каком сражении советская авиация окончательно завоевала господство в воздухе?</w:t>
-      </w:r>
-    </w:p>
-    <w:p>
-      <w:pPr>
-        <w:spacing w:after="0" w:line="240"/>
-        <w:ind w:firstLine="0"/>
-        <w:jc w:val="left"/>
-        <w:outlineLvl w:val="9"/>
-      </w:pPr>
-      <w:r>
-        <w:rPr>
-          <w:rFonts w:ascii="Times New Roman" w:cs="Times New Roman" w:eastAsia="Times New Roman" w:hAnsi="Times New Roman"/>
-          <w:b w:val="false"/>
-          <w:bCs w:val="false"/>
-          <w:sz w:val="28"/>
-          <w:szCs w:val="28"/>
-        </w:rPr>
-        <w:t xml:space="preserve">а) битва под Москвой;   б) Курская битва;   в) Сталинградская битва;   г) Берлинская операция.</w:t>
-      </w:r>
-    </w:p>
-    <w:p>
-      <w:pPr>
-        <w:spacing w:after="0" w:line="240"/>
-        <w:ind w:firstLine="0"/>
-        <w:jc w:val="left"/>
-        <w:outlineLvl w:val="9"/>
-      </w:pPr>
-      <w:r>
-        <w:rPr>
-          <w:rFonts w:ascii="Times New Roman" w:cs="Times New Roman" w:eastAsia="Times New Roman" w:hAnsi="Times New Roman"/>
-          <w:b w:val="false"/>
-          <w:bCs w:val="false"/>
-          <w:sz w:val="28"/>
-          <w:szCs w:val="28"/>
-        </w:rPr>
-        <w:t xml:space="preserve">7. Интересуетесь ли вы историей Великой Отечественной войны?</w:t>
-      </w:r>
-    </w:p>
-    <w:p>
-      <w:pPr>
-        <w:spacing w:after="0" w:line="240"/>
-        <w:ind w:firstLine="0"/>
-        <w:jc w:val="left"/>
-        <w:outlineLvl w:val="9"/>
-      </w:pPr>
-      <w:r>
-        <w:rPr>
-          <w:rFonts w:ascii="Times New Roman" w:cs="Times New Roman" w:eastAsia="Times New Roman" w:hAnsi="Times New Roman"/>
-          <w:b w:val="false"/>
-          <w:bCs w:val="false"/>
-          <w:sz w:val="28"/>
-          <w:szCs w:val="28"/>
-        </w:rPr>
-        <w:t xml:space="preserve">а) да;   б) скорее да;   в) скорее нет;   г) нет.</w:t>
-      </w:r>
-    </w:p>
-    <w:p>
-      <w:pPr>
-        <w:spacing w:after="0" w:line="240"/>
-        <w:ind w:firstLine="0"/>
-        <w:jc w:val="left"/>
-        <w:outlineLvl w:val="9"/>
-      </w:pPr>
-      <w:r>
-        <w:rPr>
-          <w:rFonts w:ascii="Times New Roman" w:cs="Times New Roman" w:eastAsia="Times New Roman" w:hAnsi="Times New Roman"/>
-          <w:b w:val="false"/>
-          <w:bCs w:val="false"/>
-          <w:sz w:val="28"/>
-          <w:szCs w:val="28"/>
-        </w:rPr>
-        <w:t xml:space="preserve">8. Нужно ли, по вашему мнению, больше рассказывать о подвигах авиаторов на уроках и мероприятиях?</w:t>
-      </w:r>
-    </w:p>
-    <w:p>
-      <w:pPr>
-        <w:spacing w:after="0" w:line="240"/>
-        <w:ind w:firstLine="0"/>
-        <w:jc w:val="left"/>
-        <w:outlineLvl w:val="9"/>
-      </w:pPr>
-      <w:r>
-        <w:rPr>
-          <w:rFonts w:ascii="Times New Roman" w:cs="Times New Roman" w:eastAsia="Times New Roman" w:hAnsi="Times New Roman"/>
-          <w:b w:val="false"/>
-          <w:bCs w:val="false"/>
-          <w:sz w:val="28"/>
-          <w:szCs w:val="28"/>
-        </w:rPr>
-        <w:t xml:space="preserve">а) да;   б) нет;   в) затрудняюсь ответить.</w:t>
-      </w:r>
-    </w:p>
-    <w:p>
-      <w:pPr>
-        <w:pageBreakBefore/>
-        <w:spacing w:after="0"/>
-        <w:jc w:val="center"/>
-        <w:outlineLvl w:val="9"/>
-      </w:pPr>
-      <w:r>
-        <w:rPr>
-          <w:rFonts w:ascii="Times New Roman" w:cs="Times New Roman" w:eastAsia="Times New Roman" w:hAnsi="Times New Roman"/>
-          <w:b/>
-          <w:bCs/>
-          <w:sz w:val="32"/>
-          <w:szCs w:val="32"/>
-        </w:rPr>
-        <w:t xml:space="preserve">ПРИЛОЖЕНИЕ В</w:t>
       </w:r>
     </w:p>
     <w:p>

</xml_diff>